<commit_message>
update checkout, payments, and store administration
</commit_message>
<xml_diff>
--- a/Bài học project.docx
+++ b/Bài học project.docx
@@ -4,6 +4,7 @@
   <w:body>
     <w:p>
       <w:pPr>
+        <w:ind w:firstLine="720"/>
         <w:rPr>
           <w:sz w:val="36"/>
           <w:szCs w:val="36"/>
@@ -438,6 +439,13 @@
           <w:szCs w:val="36"/>
         </w:rPr>
         <w:t xml:space="preserve">Admin: </w:t>
+      </w:r>
+      <w:r>
+        <w:rPr>
+          <w:sz w:val="36"/>
+          <w:szCs w:val="36"/>
+        </w:rPr>
+        <w:t xml:space="preserve">DAshboard </w:t>
       </w:r>
       <w:r>
         <w:t xml:space="preserve">Doanh thu, quản lý kho, </w:t>

</xml_diff>

<commit_message>
Update Front and backend
</commit_message>
<xml_diff>
--- a/Bài học project.docx
+++ b/Bài học project.docx
@@ -453,6 +453,82 @@
       <w:r>
         <w:t>quản lý danh mục hàng, quản lý sản phẩm, quản lý AI, quản lý tài khoản người dùng, Quản lý shop.</w:t>
       </w:r>
+      <w:r>
+        <w:br/>
+      </w:r>
+      <w:r>
+        <w:br/>
+      </w:r>
+    </w:p>
+    <w:p>
+      <w:pPr>
+        <w:pStyle w:val="ListParagraph"/>
+        <w:numPr>
+          <w:ilvl w:val="1"/>
+          <w:numId w:val="4"/>
+        </w:numPr>
+        <w:rPr>
+          <w:sz w:val="36"/>
+          <w:szCs w:val="36"/>
+        </w:rPr>
+      </w:pPr>
+      <w:r>
+        <w:rPr>
+          <w:sz w:val="36"/>
+          <w:szCs w:val="36"/>
+        </w:rPr>
+        <w:t>ở phần đơn hàng của customer có thêm button hủy khi đơn chưa được xác nhận.</w:t>
+      </w:r>
+    </w:p>
+    <w:p>
+      <w:pPr>
+        <w:pStyle w:val="ListParagraph"/>
+        <w:numPr>
+          <w:ilvl w:val="1"/>
+          <w:numId w:val="4"/>
+        </w:numPr>
+        <w:rPr>
+          <w:sz w:val="36"/>
+          <w:szCs w:val="36"/>
+        </w:rPr>
+      </w:pPr>
+      <w:r>
+        <w:rPr>
+          <w:sz w:val="36"/>
+          <w:szCs w:val="36"/>
+        </w:rPr>
+        <w:t>ở phần xử lý đơn hàng của staff mã vẫn đơn sẽ được random.</w:t>
+      </w:r>
+    </w:p>
+    <w:p>
+      <w:pPr>
+        <w:pStyle w:val="ListParagraph"/>
+        <w:numPr>
+          <w:ilvl w:val="1"/>
+          <w:numId w:val="4"/>
+        </w:numPr>
+        <w:rPr>
+          <w:sz w:val="36"/>
+          <w:szCs w:val="36"/>
+        </w:rPr>
+      </w:pPr>
+      <w:r>
+        <w:rPr>
+          <w:sz w:val="36"/>
+          <w:szCs w:val="36"/>
+        </w:rPr>
+        <w:t>Navbar của staff bỏ đi phần giỏ hàng, yêu thích và đơn hàng.</w:t>
+      </w:r>
+    </w:p>
+    <w:p>
+      <w:pPr>
+        <w:pStyle w:val="ListParagraph"/>
+        <w:ind w:left="1440"/>
+        <w:rPr>
+          <w:sz w:val="36"/>
+          <w:szCs w:val="36"/>
+        </w:rPr>
+      </w:pPr>
     </w:p>
     <w:sectPr>
       <w:pgSz w:w="12240" w:h="15840"/>
@@ -618,7 +694,7 @@
   <w:abstractNum w:abstractNumId="1" w15:restartNumberingAfterBreak="0">
     <w:nsid w:val="1BF94FA5"/>
     <w:multiLevelType w:val="multilevel"/>
-    <w:tmpl w:val="8B34C19A"/>
+    <w:tmpl w:val="0E2292BA"/>
     <w:lvl w:ilvl="0">
       <w:start w:val="1"/>
       <w:numFmt w:val="bullet"/>
@@ -635,20 +711,16 @@
         <w:sz w:val="20"/>
       </w:rPr>
     </w:lvl>
-    <w:lvl w:ilvl="1" w:tentative="1">
-      <w:start w:val="1"/>
-      <w:numFmt w:val="bullet"/>
-      <w:lvlText w:val="o"/>
-      <w:lvlJc w:val="left"/>
-      <w:pPr>
-        <w:tabs>
-          <w:tab w:val="num" w:pos="1440"/>
-        </w:tabs>
+    <w:lvl w:ilvl="1">
+      <w:start w:val="1"/>
+      <w:numFmt w:val="decimal"/>
+      <w:lvlText w:val="%2."/>
+      <w:lvlJc w:val="left"/>
+      <w:pPr>
         <w:ind w:left="1440" w:hanging="360"/>
       </w:pPr>
       <w:rPr>
-        <w:rFonts w:ascii="Courier New" w:hAnsi="Courier New" w:hint="default"/>
-        <w:sz w:val="20"/>
+        <w:rFonts w:hint="default"/>
       </w:rPr>
     </w:lvl>
     <w:lvl w:ilvl="2" w:tentative="1">
@@ -765,6 +837,155 @@
     </w:lvl>
   </w:abstractNum>
   <w:abstractNum w:abstractNumId="2" w15:restartNumberingAfterBreak="0">
+    <w:nsid w:val="309C06AA"/>
+    <w:multiLevelType w:val="multilevel"/>
+    <w:tmpl w:val="A984D566"/>
+    <w:lvl w:ilvl="0">
+      <w:start w:val="1"/>
+      <w:numFmt w:val="bullet"/>
+      <w:lvlText w:val=""/>
+      <w:lvlJc w:val="left"/>
+      <w:pPr>
+        <w:tabs>
+          <w:tab w:val="num" w:pos="720"/>
+        </w:tabs>
+        <w:ind w:left="720" w:hanging="360"/>
+      </w:pPr>
+      <w:rPr>
+        <w:rFonts w:ascii="Symbol" w:hAnsi="Symbol" w:hint="default"/>
+        <w:sz w:val="20"/>
+      </w:rPr>
+    </w:lvl>
+    <w:lvl w:ilvl="1" w:tentative="1">
+      <w:start w:val="1"/>
+      <w:numFmt w:val="bullet"/>
+      <w:lvlText w:val="o"/>
+      <w:lvlJc w:val="left"/>
+      <w:pPr>
+        <w:tabs>
+          <w:tab w:val="num" w:pos="1440"/>
+        </w:tabs>
+        <w:ind w:left="1440" w:hanging="360"/>
+      </w:pPr>
+      <w:rPr>
+        <w:rFonts w:ascii="Courier New" w:hAnsi="Courier New" w:hint="default"/>
+        <w:sz w:val="20"/>
+      </w:rPr>
+    </w:lvl>
+    <w:lvl w:ilvl="2" w:tentative="1">
+      <w:start w:val="1"/>
+      <w:numFmt w:val="bullet"/>
+      <w:lvlText w:val=""/>
+      <w:lvlJc w:val="left"/>
+      <w:pPr>
+        <w:tabs>
+          <w:tab w:val="num" w:pos="2160"/>
+        </w:tabs>
+        <w:ind w:left="2160" w:hanging="360"/>
+      </w:pPr>
+      <w:rPr>
+        <w:rFonts w:ascii="Wingdings" w:hAnsi="Wingdings" w:hint="default"/>
+        <w:sz w:val="20"/>
+      </w:rPr>
+    </w:lvl>
+    <w:lvl w:ilvl="3" w:tentative="1">
+      <w:start w:val="1"/>
+      <w:numFmt w:val="bullet"/>
+      <w:lvlText w:val=""/>
+      <w:lvlJc w:val="left"/>
+      <w:pPr>
+        <w:tabs>
+          <w:tab w:val="num" w:pos="2880"/>
+        </w:tabs>
+        <w:ind w:left="2880" w:hanging="360"/>
+      </w:pPr>
+      <w:rPr>
+        <w:rFonts w:ascii="Wingdings" w:hAnsi="Wingdings" w:hint="default"/>
+        <w:sz w:val="20"/>
+      </w:rPr>
+    </w:lvl>
+    <w:lvl w:ilvl="4" w:tentative="1">
+      <w:start w:val="1"/>
+      <w:numFmt w:val="bullet"/>
+      <w:lvlText w:val=""/>
+      <w:lvlJc w:val="left"/>
+      <w:pPr>
+        <w:tabs>
+          <w:tab w:val="num" w:pos="3600"/>
+        </w:tabs>
+        <w:ind w:left="3600" w:hanging="360"/>
+      </w:pPr>
+      <w:rPr>
+        <w:rFonts w:ascii="Wingdings" w:hAnsi="Wingdings" w:hint="default"/>
+        <w:sz w:val="20"/>
+      </w:rPr>
+    </w:lvl>
+    <w:lvl w:ilvl="5" w:tentative="1">
+      <w:start w:val="1"/>
+      <w:numFmt w:val="bullet"/>
+      <w:lvlText w:val=""/>
+      <w:lvlJc w:val="left"/>
+      <w:pPr>
+        <w:tabs>
+          <w:tab w:val="num" w:pos="4320"/>
+        </w:tabs>
+        <w:ind w:left="4320" w:hanging="360"/>
+      </w:pPr>
+      <w:rPr>
+        <w:rFonts w:ascii="Wingdings" w:hAnsi="Wingdings" w:hint="default"/>
+        <w:sz w:val="20"/>
+      </w:rPr>
+    </w:lvl>
+    <w:lvl w:ilvl="6" w:tentative="1">
+      <w:start w:val="1"/>
+      <w:numFmt w:val="bullet"/>
+      <w:lvlText w:val=""/>
+      <w:lvlJc w:val="left"/>
+      <w:pPr>
+        <w:tabs>
+          <w:tab w:val="num" w:pos="5040"/>
+        </w:tabs>
+        <w:ind w:left="5040" w:hanging="360"/>
+      </w:pPr>
+      <w:rPr>
+        <w:rFonts w:ascii="Wingdings" w:hAnsi="Wingdings" w:hint="default"/>
+        <w:sz w:val="20"/>
+      </w:rPr>
+    </w:lvl>
+    <w:lvl w:ilvl="7" w:tentative="1">
+      <w:start w:val="1"/>
+      <w:numFmt w:val="bullet"/>
+      <w:lvlText w:val=""/>
+      <w:lvlJc w:val="left"/>
+      <w:pPr>
+        <w:tabs>
+          <w:tab w:val="num" w:pos="5760"/>
+        </w:tabs>
+        <w:ind w:left="5760" w:hanging="360"/>
+      </w:pPr>
+      <w:rPr>
+        <w:rFonts w:ascii="Wingdings" w:hAnsi="Wingdings" w:hint="default"/>
+        <w:sz w:val="20"/>
+      </w:rPr>
+    </w:lvl>
+    <w:lvl w:ilvl="8" w:tentative="1">
+      <w:start w:val="1"/>
+      <w:numFmt w:val="bullet"/>
+      <w:lvlText w:val=""/>
+      <w:lvlJc w:val="left"/>
+      <w:pPr>
+        <w:tabs>
+          <w:tab w:val="num" w:pos="6480"/>
+        </w:tabs>
+        <w:ind w:left="6480" w:hanging="360"/>
+      </w:pPr>
+      <w:rPr>
+        <w:rFonts w:ascii="Wingdings" w:hAnsi="Wingdings" w:hint="default"/>
+        <w:sz w:val="20"/>
+      </w:rPr>
+    </w:lvl>
+  </w:abstractNum>
+  <w:abstractNum w:abstractNumId="3" w15:restartNumberingAfterBreak="0">
     <w:nsid w:val="4B815213"/>
     <w:multiLevelType w:val="multilevel"/>
     <w:tmpl w:val="F9467D96"/>
@@ -913,7 +1134,7 @@
       </w:rPr>
     </w:lvl>
   </w:abstractNum>
-  <w:abstractNum w:abstractNumId="3" w15:restartNumberingAfterBreak="0">
+  <w:abstractNum w:abstractNumId="4" w15:restartNumberingAfterBreak="0">
     <w:nsid w:val="575A7024"/>
     <w:multiLevelType w:val="multilevel"/>
     <w:tmpl w:val="DDB27476"/>
@@ -1063,16 +1284,19 @@
     </w:lvl>
   </w:abstractNum>
   <w:num w:numId="1" w16cid:durableId="1036856414">
-    <w:abstractNumId w:val="2"/>
+    <w:abstractNumId w:val="3"/>
   </w:num>
   <w:num w:numId="2" w16cid:durableId="813370575">
-    <w:abstractNumId w:val="3"/>
+    <w:abstractNumId w:val="4"/>
   </w:num>
   <w:num w:numId="3" w16cid:durableId="947666017">
     <w:abstractNumId w:val="0"/>
   </w:num>
   <w:num w:numId="4" w16cid:durableId="1661545524">
     <w:abstractNumId w:val="1"/>
+  </w:num>
+  <w:num w:numId="5" w16cid:durableId="435713137">
+    <w:abstractNumId w:val="2"/>
   </w:num>
 </w:numbering>
 </file>
@@ -1680,7 +1904,6 @@
   <w:style w:type="character" w:default="1" w:styleId="DefaultParagraphFont">
     <w:name w:val="Default Paragraph Font"/>
     <w:uiPriority w:val="1"/>
-    <w:semiHidden/>
     <w:unhideWhenUsed/>
   </w:style>
   <w:style w:type="table" w:default="1" w:styleId="TableNormal">

</xml_diff>